<commit_message>
docs(cic): finaliza material academico do XXXVIII CIC (poster, resumo, spec)
Regenera as figuras do poster/resumo com o gerador reproduzivel de
tools/figures, exporta os PDFs finais de poster e resumo, adiciona o
SPEC.md com o mapeamento dos 3 gaps PIBIC e versiona os logs de
treino v30/v31 referenciados no spec como WIP nao reaproveitavel.
</commit_message>
<xml_diff>
--- a/Cópia de Modelo-resumo-xxxviii-cic-unesp.docx
+++ b/Cópia de Modelo-resumo-xxxviii-cic-unesp.docx
@@ -5,8 +5,8 @@
     <w:p>
       <w:pPr>
         <w:pStyle w:val="normal1"/>
-        <w:spacing w:lineRule="auto" w:line="235" w:after="20" w:before="0"/>
-        <w:ind w:left="0" w:firstLine="0"/>
+        <w:spacing w:lineRule="auto" w:line="235" w:before="0" w:after="20"/>
+        <w:ind w:hanging="0" w:left="0"/>
         <w:jc w:val="center"/>
         <w:rPr>
           <w:rFonts w:ascii="Times New Roman" w:hAnsi="Times New Roman" w:eastAsia="Times New Roman" w:cs="Times New Roman"/>
@@ -48,7 +48,7 @@
       <w:pPr>
         <w:pStyle w:val="normal1"/>
         <w:spacing w:lineRule="auto" w:line="235" w:before="0" w:after="20"/>
-        <w:ind w:left="0" w:firstLine="0"/>
+        <w:ind w:hanging="0" w:left="0"/>
         <w:jc w:val="center"/>
         <w:rPr>
           <w:rFonts w:ascii="Times New Roman" w:hAnsi="Times New Roman" w:eastAsia="Times New Roman" w:cs="Times New Roman"/>
@@ -60,14 +60,14 @@
           <w:rFonts w:eastAsia="Times New Roman" w:cs="Times New Roman" w:ascii="Times New Roman" w:hAnsi="Times New Roman"/>
           <w:color w:val="000000"/>
         </w:rPr>
-        <w:t>RONALDO CHIAVEGATTI SAMPAIO CORRÊA, RODRIGO CAPOBIANCO GUIDO (Orientador), Instituto de Biociências, Letras e Ciências Exatas – IBILCE, Câmpus de São José do Rio Preto, ronaldo.correa@unesp.br</w:t>
+        <w:t>RONALDO CHIAVEGATTI SAMPAIO CORRÊA, RODRIGO CAPOBIANCO GUIDO, Instituto de Biociências, Letras e Ciências Exatas – IBILCE, Câmpus de São José do Rio Preto, ronaldo.correa@unesp.br</w:t>
       </w:r>
     </w:p>
     <w:p>
       <w:pPr>
         <w:pStyle w:val="normal1"/>
-        <w:spacing w:lineRule="auto" w:line="235" w:after="20" w:before="0"/>
-        <w:ind w:left="0" w:firstLine="0"/>
+        <w:spacing w:lineRule="auto" w:line="235" w:before="0" w:after="20"/>
+        <w:ind w:hanging="0" w:left="0"/>
         <w:jc w:val="center"/>
         <w:rPr>
           <w:rFonts w:ascii="Times New Roman" w:hAnsi="Times New Roman" w:eastAsia="Times New Roman" w:cs="Times New Roman"/>
@@ -93,8 +93,8 @@
     <w:p>
       <w:pPr>
         <w:pStyle w:val="normal1"/>
-        <w:spacing w:lineRule="auto" w:line="235" w:after="20" w:before="0"/>
-        <w:ind w:left="0" w:firstLine="0"/>
+        <w:spacing w:lineRule="auto" w:line="235" w:before="0" w:after="20"/>
+        <w:ind w:hanging="0" w:left="0"/>
         <w:jc w:val="center"/>
         <w:rPr>
           <w:rFonts w:ascii="Times New Roman" w:hAnsi="Times New Roman" w:eastAsia="Times New Roman" w:cs="Times New Roman"/>
@@ -146,8 +146,8 @@
     <w:p>
       <w:pPr>
         <w:pStyle w:val="normal1"/>
-        <w:spacing w:lineRule="auto" w:line="235" w:after="20" w:before="0"/>
-        <w:ind w:left="0" w:firstLine="0"/>
+        <w:spacing w:lineRule="auto" w:line="235" w:before="0" w:after="20"/>
+        <w:ind w:hanging="0" w:left="0"/>
         <w:jc w:val="both"/>
         <w:rPr>
           <w:color w:val="000000"/>
@@ -157,7 +157,7 @@
         <w:rPr>
           <w:rFonts w:ascii="Times New Roman" w:hAnsi="Times New Roman"/>
           <w:b/>
-          <w:i w:val="0"/>
+          <w:i w:val="false"/>
           <w:sz w:val="20"/>
         </w:rPr>
         <w:t xml:space="preserve">INTRODUÇÃO: </w:t>
@@ -165,18 +165,18 @@
       <w:r>
         <w:rPr>
           <w:rFonts w:ascii="Times New Roman" w:hAnsi="Times New Roman"/>
-          <w:b w:val="0"/>
-          <w:i w:val="0"/>
+          <w:b w:val="false"/>
+          <w:i w:val="false"/>
           <w:sz w:val="20"/>
         </w:rPr>
-        <w:t>O diagnóstico diferencial de distúrbios vocais costuma exigir exame endoscópico, e o caso mais difícil é separar as disfonias funcionais sem lesão estrutural — psicogênica e funcional — de quadros orgânicos como laringite e edema de Reinke. A análise acústica computacional desponta como triagem não invasiva e de baixo custo. Este trabalho avalia um classificador de cinco condições vocais a partir de vogais sustentadas, em C99 puro, sem frameworks de aprendizado de máquina. A contribuição desta etapa é metodológica: cada decisão de projeto passou por comparação A/B reprodutível — mesma semente, mesmas dobras — com adoção ou rejeição por regra fixa definida antes de ver o resultado.</w:t>
+        <w:t>Diagnosticar um distúrbio vocal quase sempre exige exame endoscópico. O caso mais difícil é separar as disfonias funcionais sem lesão estrutural — psicogênica e funcional — de quadros orgânicos como laringite e edema de Reinke. A análise acústica computacional desponta como triagem não invasiva e de baixo custo. Este trabalho avalia um classificador de cinco condições vocais a partir de vogais sustentadas, em C99 puro, sem frameworks de aprendizado de máquina. A contribuição desta etapa é metodológica: cada decisão de projeto passou por comparação A/B reprodutível — mesma semente, mesmas dobras — com adoção ou rejeição por regra fixa, definida antes do resultado.</w:t>
       </w:r>
     </w:p>
     <w:p>
       <w:pPr>
         <w:pStyle w:val="normal1"/>
-        <w:spacing w:lineRule="auto" w:line="235" w:after="20" w:before="0"/>
-        <w:ind w:left="0" w:firstLine="0"/>
+        <w:spacing w:lineRule="auto" w:line="235" w:before="0" w:after="20"/>
+        <w:ind w:hanging="0" w:left="0"/>
         <w:jc w:val="both"/>
         <w:rPr>
           <w:color w:val="000000"/>
@@ -186,7 +186,7 @@
         <w:rPr>
           <w:rFonts w:ascii="Times New Roman" w:hAnsi="Times New Roman"/>
           <w:b/>
-          <w:i w:val="0"/>
+          <w:i w:val="false"/>
           <w:sz w:val="20"/>
         </w:rPr>
         <w:t xml:space="preserve">MATERIAL E MÉTODOS: </w:t>
@@ -194,90 +194,18 @@
       <w:r>
         <w:rPr>
           <w:rFonts w:ascii="Times New Roman" w:hAnsi="Times New Roman"/>
-          <w:b w:val="0"/>
-          <w:i w:val="0"/>
+          <w:b w:val="false"/>
+          <w:i w:val="false"/>
           <w:sz w:val="20"/>
         </w:rPr>
-        <w:t xml:space="preserve">Usou-se um subconjunto de 1.098 pacientes da Saarbrücken Voice Database (BARRY; PÜTZER, 2007), nas cinco classes e nos tamanhos da Tabela 1, com as vogais sustentadas /a/, /i/ e /u/. </w:t>
-      </w:r>
-      <w:r>
-        <w:rPr>
-          <w:rFonts w:ascii="Times New Roman" w:hAnsi="Times New Roman"/>
-          <w:b/>
-          <w:i w:val="0"/>
-          <w:sz w:val="20"/>
-        </w:rPr>
-        <w:t xml:space="preserve">(i) Extração: </w:t>
-      </w:r>
-      <w:r>
-        <w:rPr>
-          <w:rFonts w:ascii="Times New Roman" w:hAnsi="Times New Roman"/>
-          <w:b w:val="0"/>
-          <w:i w:val="0"/>
-          <w:sz w:val="20"/>
-        </w:rPr>
-        <w:t xml:space="preserve">83 características por vogal — 10 temporais (jitter, shimmer, HNR, ZCR), 55 espectrais (F0, formantes F1–F4, entropia, centroide, rolloff, 13 MFCC com Δ e ΔΔ, CPP, pulso glotal) e 18 wavelet (Daubechies-4, seis níveis; GUIDO, 2022) — que, com idade e sexo, somam 251 variáveis. </w:t>
-      </w:r>
-      <w:r>
-        <w:rPr>
-          <w:rFonts w:ascii="Times New Roman" w:hAnsi="Times New Roman"/>
-          <w:b/>
-          <w:i w:val="0"/>
-          <w:sz w:val="20"/>
-        </w:rPr>
-        <w:t xml:space="preserve">(ii) Protocolo: </w:t>
-      </w:r>
-      <w:r>
-        <w:rPr>
-          <w:rFonts w:ascii="Times New Roman" w:hAnsi="Times New Roman"/>
-          <w:b w:val="0"/>
-          <w:i w:val="0"/>
-          <w:sz w:val="20"/>
-        </w:rPr>
-        <w:t xml:space="preserve">cinco dobras estratificadas, semente fixa (42); z-score ajustado só nas amostras originais de treino; augmentação e balanceamento apenas no treino de cada dobra. </w:t>
-      </w:r>
-      <w:r>
-        <w:rPr>
-          <w:rFonts w:ascii="Times New Roman" w:hAnsi="Times New Roman"/>
-          <w:b/>
-          <w:i w:val="0"/>
-          <w:sz w:val="20"/>
-        </w:rPr>
-        <w:t xml:space="preserve">(iii) Arquitetura: </w:t>
-      </w:r>
-      <w:r>
-        <w:rPr>
-          <w:rFonts w:ascii="Times New Roman" w:hAnsi="Times New Roman"/>
-          <w:b w:val="0"/>
-          <w:i w:val="0"/>
-          <w:sz w:val="20"/>
-        </w:rPr>
-        <w:t xml:space="preserve">fusão tardia multi-vogal — por vogal, uma rede binária (“Mestra”, patológico × saudável) e uma de quatro classes (“Especialista”), ambas com camadas ocultas [128, 64], LeakyReLU, dropout, L2, Adam (KINGMA; BA, 2015) e parada por Macro F1; as três vogais entram por média das probabilidades, com limiar P(patológico) ≥ 0,5. </w:t>
-      </w:r>
-      <w:r>
-        <w:rPr>
-          <w:rFonts w:ascii="Times New Roman" w:hAnsi="Times New Roman"/>
-          <w:b/>
-          <w:i w:val="0"/>
-          <w:sz w:val="20"/>
-        </w:rPr>
-        <w:t xml:space="preserve">(iv) Experimentos A/B: </w:t>
-      </w:r>
-      <w:r>
-        <w:rPr>
-          <w:rFonts w:ascii="Times New Roman" w:hAnsi="Times New Roman"/>
-          <w:b w:val="0"/>
-          <w:i w:val="0"/>
-          <w:sz w:val="20"/>
-        </w:rPr>
-        <w:t>SMOTE padrão × Borderline-SMOTE1 (HAN; WANG; MAO, 2005), doze combinações de arquitetura e regularização, e a seleção paraconsistente de características; McNemar para significância e bootstrap (N = 1000) para os intervalos.</w:t>
+        <w:t>Usou-se um subconjunto de 1.098 pacientes da Saarbrücken Voice Database (BARRY; PÜTZER, 2007), nas cinco classes e nos tamanhos da Tabela 1, com as vogais /a/, /i/ e /u/. (i) Extração: 83 características por vogal — 10 temporais (jitter, shimmer, HNR, ZCR), 55 espectrais (F0, formantes F1–F4, entropia, centroide, rolloff, 13 MFCC com Δ e ΔΔ, CPP, pulso glotal) e 18 wavelet (Daubechies-4, seis níveis; GUIDO, 2022), que com idade e sexo somam 251 variáveis. (ii) Protocolo: cinco dobras estratificadas, semente fixa (42); z-score ajustado só nas amostras originais de treino; augmentação e balanceamento restritos ao treino de cada dobra. (iii) Arquitetura: fusão tardia multi-vogal — por vogal, uma rede binária (“Mestra”, patológico × saudável) e uma de quatro classes (“Especialista”), camadas ocultas [128, 64], LeakyReLU, dropout, L2, Adam (KINGMA; BA, 2015) e parada por Macro F1; as três vogais entram por média das probabilidades, limiar P(patológico) ≥ 0,5. (iv) Experimentos A/B: SMOTE padrão contra Borderline-SMOTE1 (HAN; WANG; MAO, 2005), doze combinações de arquitetura e regularização, e seleção paraconsistente de características; McNemar para significância e bootstrap (N = 1000) para os intervalos.</w:t>
       </w:r>
     </w:p>
     <w:p>
       <w:pPr>
         <w:pStyle w:val="normal1"/>
-        <w:spacing w:lineRule="auto" w:line="235" w:after="20" w:before="0"/>
-        <w:ind w:left="0" w:firstLine="0"/>
+        <w:spacing w:lineRule="auto" w:line="235" w:before="0" w:after="20"/>
+        <w:ind w:hanging="0" w:left="0"/>
         <w:jc w:val="both"/>
         <w:rPr>
           <w:color w:val="000000"/>
@@ -287,7 +215,7 @@
         <w:rPr>
           <w:rFonts w:ascii="Times New Roman" w:hAnsi="Times New Roman"/>
           <w:b/>
-          <w:i w:val="0"/>
+          <w:i w:val="false"/>
           <w:sz w:val="20"/>
         </w:rPr>
         <w:t xml:space="preserve">RESULTADOS E DISCUSSÃO: </w:t>
@@ -295,65 +223,11 @@
       <w:r>
         <w:rPr>
           <w:rFonts w:ascii="Times New Roman" w:hAnsi="Times New Roman"/>
-          <w:b w:val="0"/>
-          <w:i w:val="0"/>
+          <w:b w:val="false"/>
+          <w:i w:val="false"/>
           <w:sz w:val="20"/>
         </w:rPr>
-        <w:t xml:space="preserve">A configuração adotada alcançou acurácia de 69,7% [IC 95%: 66,9–72,3%] e Macro F1 de 0,4587 [0,419–0,495] (Tabela 1), superando os três baselines — classe majoritária, k-NN e regressão logística — por McNemar (p &lt; 0,001 em todos). </w:t>
-      </w:r>
-      <w:r>
-        <w:rPr>
-          <w:rFonts w:ascii="Times New Roman" w:hAnsi="Times New Roman"/>
-          <w:b/>
-          <w:i w:val="0"/>
-          <w:sz w:val="20"/>
-        </w:rPr>
-        <w:t xml:space="preserve">Experimentos A/B: </w:t>
-      </w:r>
-      <w:r>
-        <w:rPr>
-          <w:rFonts w:ascii="Times New Roman" w:hAnsi="Times New Roman"/>
-          <w:b w:val="0"/>
-          <w:i w:val="0"/>
-          <w:sz w:val="20"/>
-        </w:rPr>
-        <w:t xml:space="preserve">o Borderline-SMOTE1 foi adotado por elevar o Macro F1 em 0,0228, com ganho concentrado nas duas classes menores, embora a diferença entre os braços não seja significativa (p = 0,6606); das doze combinações, [128, 64] foi mantida por ser a mais parcimoniosa dentro de um erro-padrão da melhor e não inferior a ela (p = 0,7463); e a seleção paraconsistente foi </w:t>
-      </w:r>
-      <w:r>
-        <w:rPr>
-          <w:rFonts w:ascii="Times New Roman" w:hAnsi="Times New Roman"/>
-          <w:b/>
-          <w:i w:val="0"/>
-          <w:sz w:val="20"/>
-        </w:rPr>
-        <w:t>rejeitada</w:t>
-      </w:r>
-      <w:r>
-        <w:rPr>
-          <w:rFonts w:ascii="Times New Roman" w:hAnsi="Times New Roman"/>
-          <w:b w:val="0"/>
-          <w:i w:val="0"/>
-          <w:sz w:val="20"/>
-        </w:rPr>
-        <w:t xml:space="preserve">, por não descartar nenhuma característica (0% de redução) e reduzir o Macro F1 em 0,0032 — resultado negativo reportado por transparência, não uma técnica do modelo final. </w:t>
-      </w:r>
-      <w:r>
-        <w:rPr>
-          <w:rFonts w:ascii="Times New Roman" w:hAnsi="Times New Roman"/>
-          <w:b/>
-          <w:i w:val="0"/>
-          <w:sz w:val="20"/>
-        </w:rPr>
-        <w:t xml:space="preserve">Erros: </w:t>
-      </w:r>
-      <w:r>
-        <w:rPr>
-          <w:rFonts w:ascii="Times New Roman" w:hAnsi="Times New Roman"/>
-          <w:b w:val="0"/>
-          <w:i w:val="0"/>
-          <w:sz w:val="20"/>
-        </w:rPr>
-        <w:t>Normal foi a classe mais bem discriminada (F1 = 0,867, recall de 92%), seguida do Edema de Reinke (F1 = 0,456), única com lesão estrutural. A Figura 1 mostra 37 dos 203 pacientes das duas disfonias funcionais trocados entre si — coerente com a literatura sobre sobreposição acústica entre disfonias sem lesão estrutural (LEE, 2021; VRBA et al., 2025).</w:t>
+        <w:t>A configuração adotada alcançou 69,7% de acurácia [IC 95%: 66,9–72,3%] e Macro F1 de 0,4587 [0,419–0,495] (Tabela 1), superando os três baselines — classe majoritária, k-NN e regressão logística — por McNemar (p &lt; 0,001 em todos). Nos experimentos A/B, o Borderline-SMOTE1 foi adotado por elevar o Macro F1 em 0,0228, com ganho concentrado nas duas classes menores, ainda que a diferença entre os braços não seja significativa (p = 0,6606); das doze combinações, [128, 64] foi mantida por ser a mais parcimoniosa dentro de um erro-padrão da melhor e não inferior a ela (p = 0,7463); e a seleção paraconsistente foi rejeitada — não descartou nenhuma característica (0% de redução) e ainda reduziu o Macro F1 em 0,0032, resultado negativo reportado por transparência, que não integra o modelo final. Quanto aos erros, Normal foi a classe mais bem discriminada (F1 = 0,867, recall de 92%), seguida do Edema de Reinke (F1 = 0,456), única com lesão estrutural. A Figura 1 mostra 37 dos 203 pacientes das duas disfonias funcionais trocados entre si, coerente com a literatura sobre sobreposição acústica entre disfonias sem lesão estrutural (LEE, 2021; VRBA et al., 2025).</w:t>
       </w:r>
     </w:p>
     <w:p>
@@ -369,7 +243,7 @@
         <w:rPr/>
         <w:drawing>
           <wp:inline distT="0" distB="0" distL="0" distR="0">
-            <wp:extent cx="2520000" cy="1525871"/>
+            <wp:extent cx="2520315" cy="1525905"/>
             <wp:effectExtent l="0" t="0" r="0" b="0"/>
             <wp:docPr id="3" name="Picture 52" descr=""/>
             <wp:cNvGraphicFramePr>
@@ -393,7 +267,7 @@
                   <pic:spPr bwMode="auto">
                     <a:xfrm>
                       <a:off x="0" y="0"/>
-                      <a:ext cx="2520000" cy="1525871"/>
+                      <a:ext cx="2520315" cy="1525905"/>
                     </a:xfrm>
                     <a:prstGeom prst="rect">
                       <a:avLst/>
@@ -409,8 +283,8 @@
     <w:p>
       <w:pPr>
         <w:pStyle w:val="normal1"/>
-        <w:spacing w:lineRule="auto" w:line="235" w:after="20" w:before="0"/>
-        <w:ind w:left="0" w:firstLine="0"/>
+        <w:spacing w:lineRule="auto" w:line="235" w:before="0" w:after="20"/>
+        <w:ind w:hanging="0" w:left="0"/>
         <w:jc w:val="both"/>
         <w:rPr>
           <w:color w:val="000000"/>
@@ -420,7 +294,7 @@
         <w:rPr>
           <w:rFonts w:ascii="Times New Roman" w:hAnsi="Times New Roman"/>
           <w:b/>
-          <w:i w:val="0"/>
+          <w:i w:val="false"/>
           <w:sz w:val="18"/>
         </w:rPr>
         <w:t xml:space="preserve">Figura 1. </w:t>
@@ -428,8 +302,8 @@
       <w:r>
         <w:rPr>
           <w:rFonts w:ascii="Times New Roman" w:hAnsi="Times New Roman"/>
-          <w:b w:val="0"/>
-          <w:i w:val="0"/>
+          <w:b w:val="false"/>
+          <w:i w:val="false"/>
           <w:sz w:val="18"/>
         </w:rPr>
         <w:t>Matriz de confusão agregada (1.098 pacientes, cinco dobras). Diagonal = acertos.</w:t>
@@ -438,8 +312,8 @@
     <w:p>
       <w:pPr>
         <w:pStyle w:val="normal1"/>
-        <w:spacing w:lineRule="auto" w:line="235" w:after="20" w:before="0"/>
-        <w:ind w:left="0" w:firstLine="0"/>
+        <w:spacing w:lineRule="auto" w:line="235" w:before="0" w:after="20"/>
+        <w:ind w:hanging="0" w:left="0"/>
         <w:jc w:val="both"/>
         <w:rPr>
           <w:color w:val="000000"/>
@@ -449,7 +323,7 @@
         <w:rPr>
           <w:rFonts w:ascii="Times New Roman" w:hAnsi="Times New Roman"/>
           <w:b/>
-          <w:i w:val="0"/>
+          <w:i w:val="false"/>
           <w:sz w:val="18"/>
         </w:rPr>
         <w:t xml:space="preserve">Tabela 1. </w:t>
@@ -457,8 +331,8 @@
       <w:r>
         <w:rPr>
           <w:rFonts w:ascii="Times New Roman" w:hAnsi="Times New Roman"/>
-          <w:b w:val="0"/>
-          <w:i w:val="0"/>
+          <w:b w:val="false"/>
+          <w:i w:val="false"/>
           <w:sz w:val="18"/>
         </w:rPr>
         <w:t>Desempenho por classe (predições fora da dobra de treino).</w:t>
@@ -479,10 +353,10 @@
       </w:tblPr>
       <w:tblGrid>
         <w:gridCol w:w="1616"/>
-        <w:gridCol w:w="822"/>
+        <w:gridCol w:w="821"/>
         <w:gridCol w:w="709"/>
         <w:gridCol w:w="765"/>
-        <w:gridCol w:w="482"/>
+        <w:gridCol w:w="483"/>
       </w:tblGrid>
       <w:tr>
         <w:trPr/>
@@ -501,7 +375,7 @@
               <w:pStyle w:val="normal1"/>
               <w:widowControl/>
               <w:suppressAutoHyphens w:val="true"/>
-              <w:overflowPunct w:val="false"/>
+              <w:overflowPunct w:val="true"/>
               <w:spacing w:lineRule="atLeast" w:line="1" w:before="0" w:after="0"/>
               <w:ind w:hanging="1" w:left="-1"/>
               <w:jc w:val="center"/>
@@ -521,7 +395,7 @@
               <w:rPr>
                 <w:rFonts w:ascii="Times New Roman" w:hAnsi="Times New Roman"/>
                 <w:b/>
-                <w:i w:val="0"/>
+                <w:i w:val="false"/>
                 <w:sz w:val="16"/>
               </w:rPr>
               <w:t>Classe</w:t>
@@ -530,7 +404,7 @@
         </w:tc>
         <w:tc>
           <w:tcPr>
-            <w:tcW w:w="822" w:type="dxa"/>
+            <w:tcW w:w="821" w:type="dxa"/>
             <w:tcBorders>
               <w:top w:val="single" w:sz="4" w:space="0" w:color="000000"/>
               <w:left w:val="single" w:sz="4" w:space="0" w:color="000000"/>
@@ -543,7 +417,7 @@
               <w:pStyle w:val="normal1"/>
               <w:widowControl/>
               <w:suppressAutoHyphens w:val="true"/>
-              <w:overflowPunct w:val="false"/>
+              <w:overflowPunct w:val="true"/>
               <w:spacing w:lineRule="atLeast" w:line="1" w:before="0" w:after="0"/>
               <w:ind w:hanging="1" w:left="-1"/>
               <w:jc w:val="center"/>
@@ -563,7 +437,7 @@
               <w:rPr>
                 <w:rFonts w:ascii="Times New Roman" w:hAnsi="Times New Roman"/>
                 <w:b/>
-                <w:i w:val="0"/>
+                <w:i w:val="false"/>
                 <w:sz w:val="16"/>
               </w:rPr>
               <w:t>Precisão</w:t>
@@ -585,7 +459,7 @@
               <w:pStyle w:val="normal1"/>
               <w:widowControl/>
               <w:suppressAutoHyphens w:val="true"/>
-              <w:overflowPunct w:val="false"/>
+              <w:overflowPunct w:val="true"/>
               <w:spacing w:lineRule="atLeast" w:line="1" w:before="0" w:after="0"/>
               <w:ind w:hanging="1" w:left="-1"/>
               <w:jc w:val="center"/>
@@ -605,7 +479,7 @@
               <w:rPr>
                 <w:rFonts w:ascii="Times New Roman" w:hAnsi="Times New Roman"/>
                 <w:b/>
-                <w:i w:val="0"/>
+                <w:i w:val="false"/>
                 <w:sz w:val="16"/>
               </w:rPr>
               <w:t>Recall</w:t>
@@ -627,7 +501,7 @@
               <w:pStyle w:val="normal1"/>
               <w:widowControl/>
               <w:suppressAutoHyphens w:val="true"/>
-              <w:overflowPunct w:val="false"/>
+              <w:overflowPunct w:val="true"/>
               <w:spacing w:lineRule="atLeast" w:line="1" w:before="0" w:after="0"/>
               <w:ind w:hanging="1" w:left="-1"/>
               <w:jc w:val="center"/>
@@ -647,7 +521,7 @@
               <w:rPr>
                 <w:rFonts w:ascii="Times New Roman" w:hAnsi="Times New Roman"/>
                 <w:b/>
-                <w:i w:val="0"/>
+                <w:i w:val="false"/>
                 <w:sz w:val="16"/>
               </w:rPr>
               <w:t>F1-Score</w:t>
@@ -656,7 +530,7 @@
         </w:tc>
         <w:tc>
           <w:tcPr>
-            <w:tcW w:w="482" w:type="dxa"/>
+            <w:tcW w:w="483" w:type="dxa"/>
             <w:tcBorders>
               <w:top w:val="single" w:sz="4" w:space="0" w:color="000000"/>
               <w:left w:val="single" w:sz="4" w:space="0" w:color="000000"/>
@@ -669,7 +543,7 @@
               <w:pStyle w:val="normal1"/>
               <w:widowControl/>
               <w:suppressAutoHyphens w:val="true"/>
-              <w:overflowPunct w:val="false"/>
+              <w:overflowPunct w:val="true"/>
               <w:spacing w:lineRule="atLeast" w:line="1" w:before="0" w:after="0"/>
               <w:ind w:hanging="1" w:left="-1"/>
               <w:jc w:val="center"/>
@@ -689,7 +563,7 @@
               <w:rPr>
                 <w:rFonts w:ascii="Times New Roman" w:hAnsi="Times New Roman"/>
                 <w:b/>
-                <w:i w:val="0"/>
+                <w:i w:val="false"/>
                 <w:sz w:val="16"/>
               </w:rPr>
               <w:t>n</w:t>
@@ -714,7 +588,7 @@
               <w:pStyle w:val="normal1"/>
               <w:widowControl/>
               <w:suppressAutoHyphens w:val="true"/>
-              <w:overflowPunct w:val="false"/>
+              <w:overflowPunct w:val="true"/>
               <w:spacing w:lineRule="atLeast" w:line="1" w:before="0" w:after="0"/>
               <w:ind w:hanging="1" w:left="-1"/>
               <w:jc w:val="center"/>
@@ -732,8 +606,8 @@
             <w:r>
               <w:rPr>
                 <w:rFonts w:ascii="Times New Roman" w:hAnsi="Times New Roman"/>
-                <w:b w:val="0"/>
-                <w:i w:val="0"/>
+                <w:b w:val="false"/>
+                <w:i w:val="false"/>
                 <w:sz w:val="16"/>
               </w:rPr>
               <w:t>Normal</w:t>
@@ -742,7 +616,7 @@
         </w:tc>
         <w:tc>
           <w:tcPr>
-            <w:tcW w:w="822" w:type="dxa"/>
+            <w:tcW w:w="821" w:type="dxa"/>
             <w:tcBorders>
               <w:top w:val="single" w:sz="4" w:space="0" w:color="000000"/>
               <w:left w:val="single" w:sz="4" w:space="0" w:color="000000"/>
@@ -755,7 +629,7 @@
               <w:pStyle w:val="normal1"/>
               <w:widowControl/>
               <w:suppressAutoHyphens w:val="true"/>
-              <w:overflowPunct w:val="false"/>
+              <w:overflowPunct w:val="true"/>
               <w:spacing w:lineRule="atLeast" w:line="1" w:before="0" w:after="0"/>
               <w:ind w:hanging="1" w:left="-1"/>
               <w:jc w:val="center"/>
@@ -773,8 +647,8 @@
             <w:r>
               <w:rPr>
                 <w:rFonts w:ascii="Times New Roman" w:hAnsi="Times New Roman"/>
-                <w:b w:val="0"/>
-                <w:i w:val="0"/>
+                <w:b w:val="false"/>
+                <w:i w:val="false"/>
                 <w:sz w:val="16"/>
               </w:rPr>
               <w:t>0,820</w:t>
@@ -796,7 +670,7 @@
               <w:pStyle w:val="normal1"/>
               <w:widowControl/>
               <w:suppressAutoHyphens w:val="true"/>
-              <w:overflowPunct w:val="false"/>
+              <w:overflowPunct w:val="true"/>
               <w:spacing w:lineRule="atLeast" w:line="1" w:before="0" w:after="0"/>
               <w:ind w:hanging="1" w:left="-1"/>
               <w:jc w:val="center"/>
@@ -814,8 +688,8 @@
             <w:r>
               <w:rPr>
                 <w:rFonts w:ascii="Times New Roman" w:hAnsi="Times New Roman"/>
-                <w:b w:val="0"/>
-                <w:i w:val="0"/>
+                <w:b w:val="false"/>
+                <w:i w:val="false"/>
                 <w:sz w:val="16"/>
               </w:rPr>
               <w:t>0,920</w:t>
@@ -837,7 +711,7 @@
               <w:pStyle w:val="normal1"/>
               <w:widowControl/>
               <w:suppressAutoHyphens w:val="true"/>
-              <w:overflowPunct w:val="false"/>
+              <w:overflowPunct w:val="true"/>
               <w:spacing w:lineRule="atLeast" w:line="1" w:before="0" w:after="0"/>
               <w:ind w:hanging="1" w:left="-1"/>
               <w:jc w:val="center"/>
@@ -855,8 +729,8 @@
             <w:r>
               <w:rPr>
                 <w:rFonts w:ascii="Times New Roman" w:hAnsi="Times New Roman"/>
-                <w:b w:val="0"/>
-                <w:i w:val="0"/>
+                <w:b w:val="false"/>
+                <w:i w:val="false"/>
                 <w:sz w:val="16"/>
               </w:rPr>
               <w:t>0,867</w:t>
@@ -865,7 +739,7 @@
         </w:tc>
         <w:tc>
           <w:tcPr>
-            <w:tcW w:w="482" w:type="dxa"/>
+            <w:tcW w:w="483" w:type="dxa"/>
             <w:tcBorders>
               <w:top w:val="single" w:sz="4" w:space="0" w:color="000000"/>
               <w:left w:val="single" w:sz="4" w:space="0" w:color="000000"/>
@@ -878,7 +752,7 @@
               <w:pStyle w:val="normal1"/>
               <w:widowControl/>
               <w:suppressAutoHyphens w:val="true"/>
-              <w:overflowPunct w:val="false"/>
+              <w:overflowPunct w:val="true"/>
               <w:spacing w:lineRule="atLeast" w:line="1" w:before="0" w:after="0"/>
               <w:ind w:hanging="1" w:left="-1"/>
               <w:jc w:val="center"/>
@@ -896,8 +770,8 @@
             <w:r>
               <w:rPr>
                 <w:rFonts w:ascii="Times New Roman" w:hAnsi="Times New Roman"/>
-                <w:b w:val="0"/>
-                <w:i w:val="0"/>
+                <w:b w:val="false"/>
+                <w:i w:val="false"/>
                 <w:sz w:val="16"/>
               </w:rPr>
               <w:t>687</w:t>
@@ -922,7 +796,7 @@
               <w:pStyle w:val="normal1"/>
               <w:widowControl/>
               <w:suppressAutoHyphens w:val="true"/>
-              <w:overflowPunct w:val="false"/>
+              <w:overflowPunct w:val="true"/>
               <w:spacing w:lineRule="atLeast" w:line="1" w:before="0" w:after="0"/>
               <w:ind w:hanging="1" w:left="-1"/>
               <w:jc w:val="center"/>
@@ -940,8 +814,8 @@
             <w:r>
               <w:rPr>
                 <w:rFonts w:ascii="Times New Roman" w:hAnsi="Times New Roman"/>
-                <w:b w:val="0"/>
-                <w:i w:val="0"/>
+                <w:b w:val="false"/>
+                <w:i w:val="false"/>
                 <w:sz w:val="16"/>
               </w:rPr>
               <w:t>Laringite</w:t>
@@ -950,7 +824,7 @@
         </w:tc>
         <w:tc>
           <w:tcPr>
-            <w:tcW w:w="822" w:type="dxa"/>
+            <w:tcW w:w="821" w:type="dxa"/>
             <w:tcBorders>
               <w:top w:val="single" w:sz="4" w:space="0" w:color="000000"/>
               <w:left w:val="single" w:sz="4" w:space="0" w:color="000000"/>
@@ -963,7 +837,7 @@
               <w:pStyle w:val="normal1"/>
               <w:widowControl/>
               <w:suppressAutoHyphens w:val="true"/>
-              <w:overflowPunct w:val="false"/>
+              <w:overflowPunct w:val="true"/>
               <w:spacing w:lineRule="atLeast" w:line="1" w:before="0" w:after="0"/>
               <w:ind w:hanging="1" w:left="-1"/>
               <w:jc w:val="center"/>
@@ -981,8 +855,8 @@
             <w:r>
               <w:rPr>
                 <w:rFonts w:ascii="Times New Roman" w:hAnsi="Times New Roman"/>
-                <w:b w:val="0"/>
-                <w:i w:val="0"/>
+                <w:b w:val="false"/>
+                <w:i w:val="false"/>
                 <w:sz w:val="16"/>
               </w:rPr>
               <w:t>0,523</w:t>
@@ -1004,7 +878,7 @@
               <w:pStyle w:val="normal1"/>
               <w:widowControl/>
               <w:suppressAutoHyphens w:val="true"/>
-              <w:overflowPunct w:val="false"/>
+              <w:overflowPunct w:val="true"/>
               <w:spacing w:lineRule="atLeast" w:line="1" w:before="0" w:after="0"/>
               <w:ind w:hanging="1" w:left="-1"/>
               <w:jc w:val="center"/>
@@ -1022,8 +896,8 @@
             <w:r>
               <w:rPr>
                 <w:rFonts w:ascii="Times New Roman" w:hAnsi="Times New Roman"/>
-                <w:b w:val="0"/>
-                <w:i w:val="0"/>
+                <w:b w:val="false"/>
+                <w:i w:val="false"/>
                 <w:sz w:val="16"/>
               </w:rPr>
               <w:t>0,321</w:t>
@@ -1045,7 +919,7 @@
               <w:pStyle w:val="normal1"/>
               <w:widowControl/>
               <w:suppressAutoHyphens w:val="true"/>
-              <w:overflowPunct w:val="false"/>
+              <w:overflowPunct w:val="true"/>
               <w:spacing w:lineRule="atLeast" w:line="1" w:before="0" w:after="0"/>
               <w:ind w:hanging="1" w:left="-1"/>
               <w:jc w:val="center"/>
@@ -1063,8 +937,8 @@
             <w:r>
               <w:rPr>
                 <w:rFonts w:ascii="Times New Roman" w:hAnsi="Times New Roman"/>
-                <w:b w:val="0"/>
-                <w:i w:val="0"/>
+                <w:b w:val="false"/>
+                <w:i w:val="false"/>
                 <w:sz w:val="16"/>
               </w:rPr>
               <w:t>0,398</w:t>
@@ -1073,7 +947,7 @@
         </w:tc>
         <w:tc>
           <w:tcPr>
-            <w:tcW w:w="482" w:type="dxa"/>
+            <w:tcW w:w="483" w:type="dxa"/>
             <w:tcBorders>
               <w:top w:val="single" w:sz="4" w:space="0" w:color="000000"/>
               <w:left w:val="single" w:sz="4" w:space="0" w:color="000000"/>
@@ -1086,7 +960,7 @@
               <w:pStyle w:val="normal1"/>
               <w:widowControl/>
               <w:suppressAutoHyphens w:val="true"/>
-              <w:overflowPunct w:val="false"/>
+              <w:overflowPunct w:val="true"/>
               <w:spacing w:lineRule="atLeast" w:line="1" w:before="0" w:after="0"/>
               <w:ind w:hanging="1" w:left="-1"/>
               <w:jc w:val="center"/>
@@ -1104,8 +978,8 @@
             <w:r>
               <w:rPr>
                 <w:rFonts w:ascii="Times New Roman" w:hAnsi="Times New Roman"/>
-                <w:b w:val="0"/>
-                <w:i w:val="0"/>
+                <w:b w:val="false"/>
+                <w:i w:val="false"/>
                 <w:sz w:val="16"/>
               </w:rPr>
               <w:t>140</w:t>
@@ -1130,7 +1004,7 @@
               <w:pStyle w:val="normal1"/>
               <w:widowControl/>
               <w:suppressAutoHyphens w:val="true"/>
-              <w:overflowPunct w:val="false"/>
+              <w:overflowPunct w:val="true"/>
               <w:spacing w:lineRule="atLeast" w:line="1" w:before="0" w:after="0"/>
               <w:ind w:hanging="1" w:left="-1"/>
               <w:jc w:val="center"/>
@@ -1148,8 +1022,8 @@
             <w:r>
               <w:rPr>
                 <w:rFonts w:ascii="Times New Roman" w:hAnsi="Times New Roman"/>
-                <w:b w:val="0"/>
-                <w:i w:val="0"/>
+                <w:b w:val="false"/>
+                <w:i w:val="false"/>
                 <w:sz w:val="16"/>
               </w:rPr>
               <w:t>Disfonia Psicogênica</w:t>
@@ -1158,7 +1032,7 @@
         </w:tc>
         <w:tc>
           <w:tcPr>
-            <w:tcW w:w="822" w:type="dxa"/>
+            <w:tcW w:w="821" w:type="dxa"/>
             <w:tcBorders>
               <w:top w:val="single" w:sz="4" w:space="0" w:color="000000"/>
               <w:left w:val="single" w:sz="4" w:space="0" w:color="000000"/>
@@ -1171,7 +1045,7 @@
               <w:pStyle w:val="normal1"/>
               <w:widowControl/>
               <w:suppressAutoHyphens w:val="true"/>
-              <w:overflowPunct w:val="false"/>
+              <w:overflowPunct w:val="true"/>
               <w:spacing w:lineRule="atLeast" w:line="1" w:before="0" w:after="0"/>
               <w:ind w:hanging="1" w:left="-1"/>
               <w:jc w:val="center"/>
@@ -1189,8 +1063,8 @@
             <w:r>
               <w:rPr>
                 <w:rFonts w:ascii="Times New Roman" w:hAnsi="Times New Roman"/>
-                <w:b w:val="0"/>
-                <w:i w:val="0"/>
+                <w:b w:val="false"/>
+                <w:i w:val="false"/>
                 <w:sz w:val="16"/>
               </w:rPr>
               <w:t>0,341</w:t>
@@ -1212,7 +1086,7 @@
               <w:pStyle w:val="normal1"/>
               <w:widowControl/>
               <w:suppressAutoHyphens w:val="true"/>
-              <w:overflowPunct w:val="false"/>
+              <w:overflowPunct w:val="true"/>
               <w:spacing w:lineRule="atLeast" w:line="1" w:before="0" w:after="0"/>
               <w:ind w:hanging="1" w:left="-1"/>
               <w:jc w:val="center"/>
@@ -1230,8 +1104,8 @@
             <w:r>
               <w:rPr>
                 <w:rFonts w:ascii="Times New Roman" w:hAnsi="Times New Roman"/>
-                <w:b w:val="0"/>
-                <w:i w:val="0"/>
+                <w:b w:val="false"/>
+                <w:i w:val="false"/>
                 <w:sz w:val="16"/>
               </w:rPr>
               <w:t>0,319</w:t>
@@ -1253,7 +1127,7 @@
               <w:pStyle w:val="normal1"/>
               <w:widowControl/>
               <w:suppressAutoHyphens w:val="true"/>
-              <w:overflowPunct w:val="false"/>
+              <w:overflowPunct w:val="true"/>
               <w:spacing w:lineRule="atLeast" w:line="1" w:before="0" w:after="0"/>
               <w:ind w:hanging="1" w:left="-1"/>
               <w:jc w:val="center"/>
@@ -1271,8 +1145,8 @@
             <w:r>
               <w:rPr>
                 <w:rFonts w:ascii="Times New Roman" w:hAnsi="Times New Roman"/>
-                <w:b w:val="0"/>
-                <w:i w:val="0"/>
+                <w:b w:val="false"/>
+                <w:i w:val="false"/>
                 <w:sz w:val="16"/>
               </w:rPr>
               <w:t>0,330</w:t>
@@ -1281,7 +1155,7 @@
         </w:tc>
         <w:tc>
           <w:tcPr>
-            <w:tcW w:w="482" w:type="dxa"/>
+            <w:tcW w:w="483" w:type="dxa"/>
             <w:tcBorders>
               <w:top w:val="single" w:sz="4" w:space="0" w:color="000000"/>
               <w:left w:val="single" w:sz="4" w:space="0" w:color="000000"/>
@@ -1294,7 +1168,7 @@
               <w:pStyle w:val="normal1"/>
               <w:widowControl/>
               <w:suppressAutoHyphens w:val="true"/>
-              <w:overflowPunct w:val="false"/>
+              <w:overflowPunct w:val="true"/>
               <w:spacing w:lineRule="atLeast" w:line="1" w:before="0" w:after="0"/>
               <w:ind w:hanging="1" w:left="-1"/>
               <w:jc w:val="center"/>
@@ -1312,8 +1186,8 @@
             <w:r>
               <w:rPr>
                 <w:rFonts w:ascii="Times New Roman" w:hAnsi="Times New Roman"/>
-                <w:b w:val="0"/>
-                <w:i w:val="0"/>
+                <w:b w:val="false"/>
+                <w:i w:val="false"/>
                 <w:sz w:val="16"/>
               </w:rPr>
               <w:t>91</w:t>
@@ -1338,7 +1212,7 @@
               <w:pStyle w:val="normal1"/>
               <w:widowControl/>
               <w:suppressAutoHyphens w:val="true"/>
-              <w:overflowPunct w:val="false"/>
+              <w:overflowPunct w:val="true"/>
               <w:spacing w:lineRule="atLeast" w:line="1" w:before="0" w:after="0"/>
               <w:ind w:hanging="1" w:left="-1"/>
               <w:jc w:val="center"/>
@@ -1356,8 +1230,8 @@
             <w:r>
               <w:rPr>
                 <w:rFonts w:ascii="Times New Roman" w:hAnsi="Times New Roman"/>
-                <w:b w:val="0"/>
-                <w:i w:val="0"/>
+                <w:b w:val="false"/>
+                <w:i w:val="false"/>
                 <w:sz w:val="16"/>
               </w:rPr>
               <w:t>Disfonia Funcional</w:t>
@@ -1366,7 +1240,7 @@
         </w:tc>
         <w:tc>
           <w:tcPr>
-            <w:tcW w:w="822" w:type="dxa"/>
+            <w:tcW w:w="821" w:type="dxa"/>
             <w:tcBorders>
               <w:top w:val="single" w:sz="4" w:space="0" w:color="000000"/>
               <w:left w:val="single" w:sz="4" w:space="0" w:color="000000"/>
@@ -1379,7 +1253,7 @@
               <w:pStyle w:val="normal1"/>
               <w:widowControl/>
               <w:suppressAutoHyphens w:val="true"/>
-              <w:overflowPunct w:val="false"/>
+              <w:overflowPunct w:val="true"/>
               <w:spacing w:lineRule="atLeast" w:line="1" w:before="0" w:after="0"/>
               <w:ind w:hanging="1" w:left="-1"/>
               <w:jc w:val="center"/>
@@ -1397,8 +1271,8 @@
             <w:r>
               <w:rPr>
                 <w:rFonts w:ascii="Times New Roman" w:hAnsi="Times New Roman"/>
-                <w:b w:val="0"/>
-                <w:i w:val="0"/>
+                <w:b w:val="false"/>
+                <w:i w:val="false"/>
                 <w:sz w:val="16"/>
               </w:rPr>
               <w:t>0,377</w:t>
@@ -1420,7 +1294,7 @@
               <w:pStyle w:val="normal1"/>
               <w:widowControl/>
               <w:suppressAutoHyphens w:val="true"/>
-              <w:overflowPunct w:val="false"/>
+              <w:overflowPunct w:val="true"/>
               <w:spacing w:lineRule="atLeast" w:line="1" w:before="0" w:after="0"/>
               <w:ind w:hanging="1" w:left="-1"/>
               <w:jc w:val="center"/>
@@ -1438,8 +1312,8 @@
             <w:r>
               <w:rPr>
                 <w:rFonts w:ascii="Times New Roman" w:hAnsi="Times New Roman"/>
-                <w:b w:val="0"/>
-                <w:i w:val="0"/>
+                <w:b w:val="false"/>
+                <w:i w:val="false"/>
                 <w:sz w:val="16"/>
               </w:rPr>
               <w:t>0,179</w:t>
@@ -1461,7 +1335,7 @@
               <w:pStyle w:val="normal1"/>
               <w:widowControl/>
               <w:suppressAutoHyphens w:val="true"/>
-              <w:overflowPunct w:val="false"/>
+              <w:overflowPunct w:val="true"/>
               <w:spacing w:lineRule="atLeast" w:line="1" w:before="0" w:after="0"/>
               <w:ind w:hanging="1" w:left="-1"/>
               <w:jc w:val="center"/>
@@ -1479,8 +1353,8 @@
             <w:r>
               <w:rPr>
                 <w:rFonts w:ascii="Times New Roman" w:hAnsi="Times New Roman"/>
-                <w:b w:val="0"/>
-                <w:i w:val="0"/>
+                <w:b w:val="false"/>
+                <w:i w:val="false"/>
                 <w:sz w:val="16"/>
               </w:rPr>
               <w:t>0,242</w:t>
@@ -1489,7 +1363,7 @@
         </w:tc>
         <w:tc>
           <w:tcPr>
-            <w:tcW w:w="482" w:type="dxa"/>
+            <w:tcW w:w="483" w:type="dxa"/>
             <w:tcBorders>
               <w:top w:val="single" w:sz="4" w:space="0" w:color="000000"/>
               <w:left w:val="single" w:sz="4" w:space="0" w:color="000000"/>
@@ -1502,7 +1376,7 @@
               <w:pStyle w:val="normal1"/>
               <w:widowControl/>
               <w:suppressAutoHyphens w:val="true"/>
-              <w:overflowPunct w:val="false"/>
+              <w:overflowPunct w:val="true"/>
               <w:spacing w:lineRule="atLeast" w:line="1" w:before="0" w:after="0"/>
               <w:ind w:hanging="1" w:left="-1"/>
               <w:jc w:val="center"/>
@@ -1520,8 +1394,8 @@
             <w:r>
               <w:rPr>
                 <w:rFonts w:ascii="Times New Roman" w:hAnsi="Times New Roman"/>
-                <w:b w:val="0"/>
-                <w:i w:val="0"/>
+                <w:b w:val="false"/>
+                <w:i w:val="false"/>
                 <w:sz w:val="16"/>
               </w:rPr>
               <w:t>112</w:t>
@@ -1546,7 +1420,7 @@
               <w:pStyle w:val="normal1"/>
               <w:widowControl/>
               <w:suppressAutoHyphens w:val="true"/>
-              <w:overflowPunct w:val="false"/>
+              <w:overflowPunct w:val="true"/>
               <w:spacing w:lineRule="atLeast" w:line="1" w:before="0" w:after="0"/>
               <w:ind w:hanging="1" w:left="-1"/>
               <w:jc w:val="center"/>
@@ -1564,8 +1438,8 @@
             <w:r>
               <w:rPr>
                 <w:rFonts w:ascii="Times New Roman" w:hAnsi="Times New Roman"/>
-                <w:b w:val="0"/>
-                <w:i w:val="0"/>
+                <w:b w:val="false"/>
+                <w:i w:val="false"/>
                 <w:sz w:val="16"/>
               </w:rPr>
               <w:t>Edema de Reinke</w:t>
@@ -1574,7 +1448,7 @@
         </w:tc>
         <w:tc>
           <w:tcPr>
-            <w:tcW w:w="822" w:type="dxa"/>
+            <w:tcW w:w="821" w:type="dxa"/>
             <w:tcBorders>
               <w:top w:val="single" w:sz="4" w:space="0" w:color="000000"/>
               <w:left w:val="single" w:sz="4" w:space="0" w:color="000000"/>
@@ -1587,7 +1461,7 @@
               <w:pStyle w:val="normal1"/>
               <w:widowControl/>
               <w:suppressAutoHyphens w:val="true"/>
-              <w:overflowPunct w:val="false"/>
+              <w:overflowPunct w:val="true"/>
               <w:spacing w:lineRule="atLeast" w:line="1" w:before="0" w:after="0"/>
               <w:ind w:hanging="1" w:left="-1"/>
               <w:jc w:val="center"/>
@@ -1605,8 +1479,8 @@
             <w:r>
               <w:rPr>
                 <w:rFonts w:ascii="Times New Roman" w:hAnsi="Times New Roman"/>
-                <w:b w:val="0"/>
-                <w:i w:val="0"/>
+                <w:b w:val="false"/>
+                <w:i w:val="false"/>
                 <w:sz w:val="16"/>
               </w:rPr>
               <w:t>0,379</w:t>
@@ -1628,7 +1502,7 @@
               <w:pStyle w:val="normal1"/>
               <w:widowControl/>
               <w:suppressAutoHyphens w:val="true"/>
-              <w:overflowPunct w:val="false"/>
+              <w:overflowPunct w:val="true"/>
               <w:spacing w:lineRule="atLeast" w:line="1" w:before="0" w:after="0"/>
               <w:ind w:hanging="1" w:left="-1"/>
               <w:jc w:val="center"/>
@@ -1646,8 +1520,8 @@
             <w:r>
               <w:rPr>
                 <w:rFonts w:ascii="Times New Roman" w:hAnsi="Times New Roman"/>
-                <w:b w:val="0"/>
-                <w:i w:val="0"/>
+                <w:b w:val="false"/>
+                <w:i w:val="false"/>
                 <w:sz w:val="16"/>
               </w:rPr>
               <w:t>0,574</w:t>
@@ -1669,7 +1543,7 @@
               <w:pStyle w:val="normal1"/>
               <w:widowControl/>
               <w:suppressAutoHyphens w:val="true"/>
-              <w:overflowPunct w:val="false"/>
+              <w:overflowPunct w:val="true"/>
               <w:spacing w:lineRule="atLeast" w:line="1" w:before="0" w:after="0"/>
               <w:ind w:hanging="1" w:left="-1"/>
               <w:jc w:val="center"/>
@@ -1687,8 +1561,8 @@
             <w:r>
               <w:rPr>
                 <w:rFonts w:ascii="Times New Roman" w:hAnsi="Times New Roman"/>
-                <w:b w:val="0"/>
-                <w:i w:val="0"/>
+                <w:b w:val="false"/>
+                <w:i w:val="false"/>
                 <w:sz w:val="16"/>
               </w:rPr>
               <w:t>0,456</w:t>
@@ -1697,7 +1571,7 @@
         </w:tc>
         <w:tc>
           <w:tcPr>
-            <w:tcW w:w="482" w:type="dxa"/>
+            <w:tcW w:w="483" w:type="dxa"/>
             <w:tcBorders>
               <w:top w:val="single" w:sz="4" w:space="0" w:color="000000"/>
               <w:left w:val="single" w:sz="4" w:space="0" w:color="000000"/>
@@ -1710,7 +1584,7 @@
               <w:pStyle w:val="normal1"/>
               <w:widowControl/>
               <w:suppressAutoHyphens w:val="true"/>
-              <w:overflowPunct w:val="false"/>
+              <w:overflowPunct w:val="true"/>
               <w:spacing w:lineRule="atLeast" w:line="1" w:before="0" w:after="0"/>
               <w:ind w:hanging="1" w:left="-1"/>
               <w:jc w:val="center"/>
@@ -1728,8 +1602,8 @@
             <w:r>
               <w:rPr>
                 <w:rFonts w:ascii="Times New Roman" w:hAnsi="Times New Roman"/>
-                <w:b w:val="0"/>
-                <w:i w:val="0"/>
+                <w:b w:val="false"/>
+                <w:i w:val="false"/>
                 <w:sz w:val="16"/>
               </w:rPr>
               <w:t>68</w:t>
@@ -1741,8 +1615,8 @@
     <w:p>
       <w:pPr>
         <w:pStyle w:val="normal1"/>
-        <w:spacing w:lineRule="auto" w:line="235" w:after="20" w:before="0"/>
-        <w:ind w:left="0" w:firstLine="0"/>
+        <w:spacing w:lineRule="auto" w:line="235" w:before="0" w:after="20"/>
+        <w:ind w:hanging="0" w:left="0"/>
         <w:jc w:val="both"/>
         <w:rPr>
           <w:color w:val="000000"/>
@@ -1752,7 +1626,7 @@
         <w:rPr>
           <w:rFonts w:ascii="Times New Roman" w:hAnsi="Times New Roman"/>
           <w:b/>
-          <w:i w:val="0"/>
+          <w:i w:val="false"/>
           <w:sz w:val="20"/>
         </w:rPr>
         <w:t xml:space="preserve">CONCLUSÕES: </w:t>
@@ -1760,47 +1634,18 @@
       <w:r>
         <w:rPr>
           <w:rFonts w:ascii="Times New Roman" w:hAnsi="Times New Roman"/>
-          <w:b w:val="0"/>
-          <w:i w:val="0"/>
+          <w:b w:val="false"/>
+          <w:i w:val="false"/>
           <w:sz w:val="20"/>
         </w:rPr>
-        <w:t>A triagem entre voz saudável e patológica mostrou-se viável (Normal: F1 = 0,867, recall de 92%) e o Edema de Reinke foi separado com F1 de 0,456. O diferencial entre as duas disfonias funcionais segue como gargalo: F1 de 0,330 e 0,242, sem que nenhum dos 12 braços superasse 0,36 e 0,27 nessas classes — evidência de um teto do próprio sinal acústico, que deve exigir informação além da voz. Das três técnicas previstas na proposta original, duas se confirmaram e uma foi descartada pela evidência A/B.</w:t>
-      </w:r>
-    </w:p>
-    <w:p>
-      <w:pPr>
-        <w:pStyle w:val="normal1"/>
-        <w:spacing w:lineRule="auto" w:line="235" w:after="20" w:before="0"/>
-        <w:ind w:left="0" w:firstLine="0"/>
-        <w:jc w:val="both"/>
-        <w:rPr>
-          <w:color w:val="000000"/>
-        </w:rPr>
-      </w:pPr>
-      <w:r>
-        <w:rPr>
-          <w:rFonts w:ascii="Times New Roman" w:hAnsi="Times New Roman"/>
-          <w:b/>
-          <w:i w:val="0"/>
-          <w:sz w:val="20"/>
-        </w:rPr>
-        <w:t xml:space="preserve">AGRADECIMENTOS: </w:t>
-      </w:r>
-      <w:r>
-        <w:rPr>
-          <w:rFonts w:ascii="Times New Roman" w:hAnsi="Times New Roman"/>
-          <w:b w:val="0"/>
-          <w:i w:val="0"/>
-          <w:sz w:val="20"/>
-        </w:rPr>
-        <w:t>Ao Prof. Dr. Eng. Rodrigo Capobianco Guido, pela orientação; ao IBILCE/Unesp, pela infraestrutura; e aos autores da Saarbrücken Voice Database. IC voluntária, sem bolsa.</w:t>
+        <w:t>A triagem entre voz saudável e patológica se mostrou viável (Normal: F1 = 0,867, recall de 92%), e o Edema de Reinke foi separado com F1 de 0,456. O diferencial entre as duas disfonias funcionais segue como gargalo: F1 de 0,330 e 0,242, sem que nenhum dos 12 braços superasse 0,36 e 0,27 nessas classes — evidência de um teto do próprio sinal acústico, que deve exigir informação além da voz. Das três técnicas previstas na proposta original, duas se confirmaram e uma foi descartada pela evidência A/B.</w:t>
       </w:r>
     </w:p>
     <w:p>
       <w:pPr>
         <w:pStyle w:val="normal1"/>
         <w:spacing w:lineRule="auto" w:line="235" w:before="0" w:after="20"/>
-        <w:ind w:left="0" w:firstLine="0"/>
+        <w:ind w:hanging="0" w:left="0"/>
         <w:jc w:val="both"/>
         <w:rPr>
           <w:color w:val="000000"/>
@@ -1810,49 +1655,46 @@
         <w:rPr>
           <w:rFonts w:ascii="Times New Roman" w:hAnsi="Times New Roman"/>
           <w:b/>
-          <w:i w:val="0"/>
+          <w:i w:val="false"/>
           <w:sz w:val="20"/>
         </w:rPr>
-        <w:t>REFERÊNCIAS</w:t>
+        <w:t xml:space="preserve">AGRADECIMENTOS: </w:t>
+      </w:r>
+      <w:r>
+        <w:rPr>
+          <w:rFonts w:ascii="Times New Roman" w:hAnsi="Times New Roman"/>
+          <w:b w:val="false"/>
+          <w:i w:val="false"/>
+          <w:sz w:val="20"/>
+        </w:rPr>
+        <w:t>Ao Prof. Dr. Eng. Rodrigo Capobianco Guido, pela orientação; ao IBILCE/Unesp, pela infraestrutura; e aos autores da Saarbrücken Voice Database. IC voluntária, sem bolsa.</w:t>
       </w:r>
     </w:p>
     <w:p>
       <w:pPr>
         <w:pStyle w:val="normal1"/>
         <w:spacing w:lineRule="auto" w:line="235" w:before="0" w:after="20"/>
-        <w:ind w:left="0" w:firstLine="0"/>
+        <w:ind w:hanging="0" w:left="0"/>
         <w:jc w:val="both"/>
         <w:rPr>
-          <w:rFonts w:ascii="Times New Roman" w:hAnsi="Times New Roman" w:eastAsia="Times New Roman" w:cs="Times New Roman"/>
           <w:color w:val="000000"/>
-          <w:sz w:val="16"/>
-          <w:szCs w:val="16"/>
         </w:rPr>
       </w:pPr>
       <w:r>
         <w:rPr>
           <w:rFonts w:ascii="Times New Roman" w:hAnsi="Times New Roman"/>
           <w:b/>
-          <w:i w:val="0"/>
-          <w:sz w:val="16"/>
-        </w:rPr>
-        <w:t xml:space="preserve">BARRY, W. J.; PÜTZER, M. </w:t>
-      </w:r>
-      <w:r>
-        <w:rPr>
-          <w:rFonts w:ascii="Times New Roman" w:hAnsi="Times New Roman"/>
-          <w:b w:val="0"/>
-          <w:i w:val="0"/>
-          <w:sz w:val="16"/>
-        </w:rPr>
-        <w:t>Saarbrücken Voice Database. Universität des Saarlandes, 2007. Acesso em: 26 jul. 2026.</w:t>
+          <w:i w:val="false"/>
+          <w:sz w:val="20"/>
+        </w:rPr>
+        <w:t>REFERÊNCIAS</w:t>
       </w:r>
     </w:p>
     <w:p>
       <w:pPr>
         <w:pStyle w:val="normal1"/>
         <w:spacing w:lineRule="auto" w:line="235" w:before="0" w:after="20"/>
-        <w:ind w:left="0" w:firstLine="0"/>
+        <w:ind w:hanging="0" w:left="0"/>
         <w:jc w:val="both"/>
         <w:rPr>
           <w:rFonts w:ascii="Times New Roman" w:hAnsi="Times New Roman" w:eastAsia="Times New Roman" w:cs="Times New Roman"/>
@@ -1865,26 +1707,26 @@
         <w:rPr>
           <w:rFonts w:ascii="Times New Roman" w:hAnsi="Times New Roman"/>
           <w:b/>
-          <w:i w:val="0"/>
+          <w:i w:val="false"/>
           <w:sz w:val="16"/>
         </w:rPr>
-        <w:t xml:space="preserve">HAN, H.; WANG, W.-Y.; MAO, B.-H. </w:t>
+        <w:t xml:space="preserve">BARRY, W. J.; PÜTZER, M. </w:t>
       </w:r>
       <w:r>
         <w:rPr>
           <w:rFonts w:ascii="Times New Roman" w:hAnsi="Times New Roman"/>
-          <w:b w:val="0"/>
-          <w:i w:val="0"/>
+          <w:b w:val="false"/>
+          <w:i w:val="false"/>
           <w:sz w:val="16"/>
         </w:rPr>
-        <w:t>Borderline-SMOTE: a new over-sampling method in imbalanced data sets learning. LNCS, v. 3644, p. 878-887, 2005.</w:t>
+        <w:t>Saarbrücken Voice Database. Universität des Saarlandes, 2007. Acesso em: 26 jul. 2026.</w:t>
       </w:r>
     </w:p>
     <w:p>
       <w:pPr>
         <w:pStyle w:val="normal1"/>
         <w:spacing w:lineRule="auto" w:line="235" w:before="0" w:after="20"/>
-        <w:ind w:left="0" w:firstLine="0"/>
+        <w:ind w:hanging="0" w:left="0"/>
         <w:jc w:val="both"/>
         <w:rPr>
           <w:rFonts w:ascii="Times New Roman" w:hAnsi="Times New Roman" w:eastAsia="Times New Roman" w:cs="Times New Roman"/>
@@ -1897,26 +1739,26 @@
         <w:rPr>
           <w:rFonts w:ascii="Times New Roman" w:hAnsi="Times New Roman"/>
           <w:b/>
-          <w:i w:val="0"/>
+          <w:i w:val="false"/>
           <w:sz w:val="16"/>
         </w:rPr>
-        <w:t xml:space="preserve">GUIDO, R. C. </w:t>
+        <w:t xml:space="preserve">HAN, H.; WANG, W.-Y.; MAO, B.-H. </w:t>
       </w:r>
       <w:r>
         <w:rPr>
           <w:rFonts w:ascii="Times New Roman" w:hAnsi="Times New Roman"/>
-          <w:b w:val="0"/>
-          <w:i w:val="0"/>
+          <w:b w:val="false"/>
+          <w:i w:val="false"/>
           <w:sz w:val="16"/>
         </w:rPr>
-        <w:t>Wavelets behind the scenes: practical aspects, insights, and perspectives. Physics Reports, v. 985, 2022.</w:t>
+        <w:t>Borderline-SMOTE: a new over-sampling method in imbalanced data sets learning. LNCS, v. 3644, p. 878-887, 2005.</w:t>
       </w:r>
     </w:p>
     <w:p>
       <w:pPr>
         <w:pStyle w:val="normal1"/>
         <w:spacing w:lineRule="auto" w:line="235" w:before="0" w:after="20"/>
-        <w:ind w:left="0" w:firstLine="0"/>
+        <w:ind w:hanging="0" w:left="0"/>
         <w:jc w:val="both"/>
         <w:rPr>
           <w:rFonts w:ascii="Times New Roman" w:hAnsi="Times New Roman" w:eastAsia="Times New Roman" w:cs="Times New Roman"/>
@@ -1929,68 +1771,102 @@
         <w:rPr>
           <w:rFonts w:ascii="Times New Roman" w:hAnsi="Times New Roman"/>
           <w:b/>
-          <w:i w:val="0"/>
+          <w:i w:val="false"/>
           <w:sz w:val="16"/>
         </w:rPr>
-        <w:t xml:space="preserve">KINGMA, D. P.; BA, J. </w:t>
+        <w:t xml:space="preserve">GUIDO, R. C. </w:t>
       </w:r>
       <w:r>
         <w:rPr>
           <w:rFonts w:ascii="Times New Roman" w:hAnsi="Times New Roman"/>
-          <w:b w:val="0"/>
-          <w:i w:val="0"/>
+          <w:b w:val="false"/>
+          <w:i w:val="false"/>
           <w:sz w:val="16"/>
         </w:rPr>
-        <w:t>Adam: a method for stochastic optimization. ICLR, 2015.</w:t>
+        <w:t>Wavelets behind the scenes: practical aspects, insights, and perspectives. Physics Reports, v. 985, p. 1-23, 2022.</w:t>
       </w:r>
     </w:p>
     <w:p>
       <w:pPr>
         <w:pStyle w:val="normal1"/>
-        <w:spacing w:after="20" w:before="0" w:line="235" w:lineRule="auto"/>
-        <w:ind w:firstLine="0"/>
+        <w:spacing w:lineRule="auto" w:line="235" w:before="0" w:after="20"/>
+        <w:ind w:hanging="0" w:left="0"/>
         <w:jc w:val="both"/>
+        <w:rPr>
+          <w:rFonts w:ascii="Times New Roman" w:hAnsi="Times New Roman" w:eastAsia="Times New Roman" w:cs="Times New Roman"/>
+          <w:color w:val="000000"/>
+          <w:sz w:val="16"/>
+          <w:szCs w:val="16"/>
+        </w:rPr>
       </w:pPr>
       <w:r>
         <w:rPr>
           <w:rFonts w:ascii="Times New Roman" w:hAnsi="Times New Roman"/>
           <w:b/>
-          <w:i w:val="0"/>
+          <w:i w:val="false"/>
           <w:sz w:val="16"/>
         </w:rPr>
-        <w:t xml:space="preserve">LEE, J.-Y. </w:t>
+        <w:t xml:space="preserve">KINGMA, D. P.; BA, J. </w:t>
       </w:r>
       <w:r>
         <w:rPr>
           <w:rFonts w:ascii="Times New Roman" w:hAnsi="Times New Roman"/>
-          <w:b w:val="0"/>
-          <w:i w:val="0"/>
+          <w:b w:val="false"/>
+          <w:i w:val="false"/>
           <w:sz w:val="16"/>
         </w:rPr>
-        <w:t>Experimental evaluation of deep learning methods for an intelligent pathological voice detection system using the Saarbruecken Voice Database. Applied Sciences, v. 11, n. 15, art. 7149, 2021.</w:t>
+        <w:t>Adam: a method for stochastic optimization. ICLR, 2015.</w:t>
       </w:r>
     </w:p>
     <w:p>
       <w:pPr>
         <w:pStyle w:val="normal1"/>
-        <w:spacing w:after="20" w:before="0" w:line="235" w:lineRule="auto"/>
-        <w:ind w:firstLine="0"/>
+        <w:spacing w:lineRule="auto" w:line="235" w:before="0" w:after="20"/>
+        <w:ind w:hanging="0"/>
         <w:jc w:val="both"/>
+        <w:rPr/>
       </w:pPr>
       <w:r>
         <w:rPr>
           <w:rFonts w:ascii="Times New Roman" w:hAnsi="Times New Roman"/>
           <w:b/>
-          <w:i w:val="0"/>
+          <w:i w:val="false"/>
           <w:sz w:val="16"/>
         </w:rPr>
+        <w:t xml:space="preserve">LEE, J.-Y. </w:t>
+      </w:r>
+      <w:r>
+        <w:rPr>
+          <w:rFonts w:ascii="Times New Roman" w:hAnsi="Times New Roman"/>
+          <w:b w:val="false"/>
+          <w:i w:val="false"/>
+          <w:sz w:val="16"/>
+        </w:rPr>
+        <w:t>Experimental evaluation of deep learning methods for an intelligent pathological voice detection system using the Saarbruecken Voice Database. Applied Sciences, v. 11, n. 15, art. 7149, 2021.</w:t>
+      </w:r>
+    </w:p>
+    <w:p>
+      <w:pPr>
+        <w:pStyle w:val="normal1"/>
+        <w:spacing w:lineRule="auto" w:line="235" w:before="0" w:after="20"/>
+        <w:ind w:hanging="0"/>
+        <w:jc w:val="both"/>
+        <w:rPr/>
+      </w:pPr>
+      <w:r>
+        <w:rPr>
+          <w:rFonts w:ascii="Times New Roman" w:hAnsi="Times New Roman"/>
+          <w:b/>
+          <w:i w:val="false"/>
+          <w:sz w:val="16"/>
+        </w:rPr>
         <w:t xml:space="preserve">VRBA, J. et al. </w:t>
       </w:r>
       <w:r>
         <w:rPr>
           <w:rFonts w:ascii="Times New Roman" w:hAnsi="Times New Roman"/>
-          <w:b w:val="0"/>
-          <w:i w:val="0"/>
+          <w:b w:val="false"/>
+          <w:i w:val="false"/>
           <w:sz w:val="16"/>
         </w:rPr>
         <w:t>Reproducible machine learning-based voice pathology detection: introducing the pitch difference feature. Journal of Voice, 2025.</w:t>
@@ -2246,7 +2122,7 @@
     <w:pPr>
       <w:widowControl w:val="false"/>
       <w:suppressAutoHyphens w:val="true"/>
-      <w:overflowPunct w:val="false"/>
+      <w:overflowPunct w:val="true"/>
       <w:bidi w:val="0"/>
       <w:spacing w:before="0" w:after="0"/>
       <w:jc w:val="left"/>
@@ -2823,7 +2699,7 @@
     <w:pPr>
       <w:widowControl/>
       <w:suppressAutoHyphens w:val="true"/>
-      <w:overflowPunct w:val="false"/>
+      <w:overflowPunct w:val="true"/>
       <w:bidi w:val="0"/>
       <w:spacing w:before="0" w:after="0"/>
       <w:ind w:hanging="1"/>
@@ -2878,7 +2754,7 @@
     <w:pPr>
       <w:widowControl/>
       <w:suppressAutoHyphens w:val="true"/>
-      <w:overflowPunct w:val="false"/>
+      <w:overflowPunct w:val="true"/>
       <w:bidi w:val="0"/>
       <w:spacing w:before="0" w:after="0"/>
       <w:ind w:hanging="1"/>
@@ -2987,7 +2863,7 @@
     <w:pPr>
       <w:widowControl/>
       <w:suppressAutoHyphens w:val="true"/>
-      <w:overflowPunct w:val="false"/>
+      <w:overflowPunct w:val="true"/>
       <w:bidi w:val="0"/>
       <w:spacing w:lineRule="atLeast" w:line="240" w:before="0" w:after="120"/>
       <w:ind w:hanging="1" w:left="-1" w:right="3024"/>
@@ -3054,7 +2930,7 @@
         <w:bottom w:val="single" w:sz="6" w:space="12" w:color="000000"/>
       </w:pBdr>
       <w:suppressAutoHyphens w:val="true"/>
-      <w:overflowPunct w:val="false"/>
+      <w:overflowPunct w:val="true"/>
       <w:bidi w:val="0"/>
       <w:spacing w:lineRule="atLeast" w:line="220" w:before="200" w:after="200"/>
       <w:ind w:hanging="1" w:left="-1"/>
@@ -3178,7 +3054,7 @@
         <w:bottom w:val="single" w:sz="6" w:space="1" w:color="800000"/>
       </w:pBdr>
       <w:suppressAutoHyphens w:val="true"/>
-      <w:overflowPunct w:val="false"/>
+      <w:overflowPunct w:val="true"/>
       <w:bidi w:val="0"/>
       <w:spacing w:lineRule="atLeast" w:line="20" w:before="240" w:after="300"/>
       <w:ind w:hanging="1" w:left="-1"/>

</xml_diff>